<commit_message>
UI layout: separate entry msgs, summary after save, month info in menu
</commit_message>
<xml_diff>
--- a/outputs/Logsheet_June_2026_Test.docx
+++ b/outputs/Logsheet_June_2026_Test.docx
@@ -52,10 +52,10 @@
         <w:gridCol w:w="956"/>
         <w:gridCol w:w="159"/>
         <w:gridCol w:w="963"/>
-        <w:gridCol w:w="900"/>
         <w:gridCol w:w="1080"/>
+        <w:gridCol w:w="990"/>
         <w:gridCol w:w="1080"/>
-        <w:gridCol w:w="1260"/>
+        <w:gridCol w:w="1170"/>
         <w:gridCol w:w="155"/>
       </w:tblGrid>
       <w:tr>
@@ -108,7 +108,18 @@
                 <w:sz w:val="32"/>
                 <w:szCs w:val="32"/>
               </w:rPr>
-              <w:t xml:space="preserve"> wjwg‡UW</w:t>
+              <w:t xml:space="preserve"> wjwg‡</w:t>
+            </w:r>
+            <w:bookmarkStart w:id="0" w:name="_GoBack"/>
+            <w:bookmarkEnd w:id="0"/>
+            <w:r>
+              <w:rPr>
+                <w:rFonts w:ascii="SutonnyMJ" w:hAnsi="SutonnyMJ" w:cs="SutonnyMJ"/>
+                <w:b/>
+                <w:sz w:val="32"/>
+                <w:szCs w:val="32"/>
+              </w:rPr>
+              <w:t>UW</w:t>
             </w:r>
           </w:p>
         </w:tc>
@@ -604,53 +615,6 @@
         </w:tc>
         <w:tc>
           <w:tcPr>
-            <w:tcW w:w="900" w:type="dxa"/>
-            <w:vMerge w:val="restart"/>
-            <w:vAlign w:val="center"/>
-          </w:tcPr>
-          <w:p>
-            <w:pPr>
-              <w:jc w:val="center"/>
-              <w:rPr>
-                <w:rFonts w:ascii="SutonnyMJ" w:hAnsi="SutonnyMJ" w:cs="SutonnyMJ"/>
-                <w:b/>
-                <w:sz w:val="24"/>
-                <w:szCs w:val="24"/>
-              </w:rPr>
-            </w:pPr>
-            <w:r>
-              <w:rPr>
-                <w:rFonts w:ascii="SutonnyMJ" w:hAnsi="SutonnyMJ" w:cs="SutonnyMJ"/>
-                <w:b/>
-                <w:sz w:val="24"/>
-                <w:szCs w:val="24"/>
-              </w:rPr>
-              <w:t>gwej</w:t>
-            </w:r>
-          </w:p>
-          <w:p>
-            <w:pPr>
-              <w:jc w:val="center"/>
-              <w:rPr>
-                <w:rFonts w:ascii="SutonnyMJ" w:hAnsi="SutonnyMJ" w:cs="SutonnyMJ"/>
-                <w:b/>
-                <w:sz w:val="24"/>
-                <w:szCs w:val="24"/>
-              </w:rPr>
-            </w:pPr>
-            <w:r>
-              <w:rPr>
-                <w:rFonts w:ascii="SutonnyMJ" w:hAnsi="SutonnyMJ" w:cs="SutonnyMJ"/>
-                <w:b/>
-                <w:sz w:val="24"/>
-                <w:szCs w:val="24"/>
-              </w:rPr>
-              <w:t>cwieZ©b</w:t>
-            </w:r>
-          </w:p>
-        </w:tc>
-        <w:tc>
-          <w:tcPr>
             <w:tcW w:w="1080" w:type="dxa"/>
             <w:vMerge w:val="restart"/>
             <w:vAlign w:val="center"/>
@@ -672,6 +636,53 @@
                 <w:sz w:val="24"/>
                 <w:szCs w:val="24"/>
               </w:rPr>
+              <w:t>gwej</w:t>
+            </w:r>
+          </w:p>
+          <w:p>
+            <w:pPr>
+              <w:jc w:val="center"/>
+              <w:rPr>
+                <w:rFonts w:ascii="SutonnyMJ" w:hAnsi="SutonnyMJ" w:cs="SutonnyMJ"/>
+                <w:b/>
+                <w:sz w:val="24"/>
+                <w:szCs w:val="24"/>
+              </w:rPr>
+            </w:pPr>
+            <w:r>
+              <w:rPr>
+                <w:rFonts w:ascii="SutonnyMJ" w:hAnsi="SutonnyMJ" w:cs="SutonnyMJ"/>
+                <w:b/>
+                <w:sz w:val="24"/>
+                <w:szCs w:val="24"/>
+              </w:rPr>
+              <w:t>cwieZ©b</w:t>
+            </w:r>
+          </w:p>
+        </w:tc>
+        <w:tc>
+          <w:tcPr>
+            <w:tcW w:w="990" w:type="dxa"/>
+            <w:vMerge w:val="restart"/>
+            <w:vAlign w:val="center"/>
+          </w:tcPr>
+          <w:p>
+            <w:pPr>
+              <w:jc w:val="center"/>
+              <w:rPr>
+                <w:rFonts w:ascii="SutonnyMJ" w:hAnsi="SutonnyMJ" w:cs="SutonnyMJ"/>
+                <w:b/>
+                <w:sz w:val="24"/>
+                <w:szCs w:val="24"/>
+              </w:rPr>
+            </w:pPr>
+            <w:r>
+              <w:rPr>
+                <w:rFonts w:ascii="SutonnyMJ" w:hAnsi="SutonnyMJ" w:cs="SutonnyMJ"/>
+                <w:b/>
+                <w:sz w:val="24"/>
+                <w:szCs w:val="24"/>
+              </w:rPr>
               <w:t>wW G</w:t>
             </w:r>
           </w:p>
@@ -725,7 +736,7 @@
         </w:tc>
         <w:tc>
           <w:tcPr>
-            <w:tcW w:w="1415" w:type="dxa"/>
+            <w:tcW w:w="1325" w:type="dxa"/>
             <w:gridSpan w:val="2"/>
             <w:vMerge w:val="restart"/>
             <w:vAlign w:val="center"/>
@@ -736,16 +747,12 @@
               <w:rPr>
                 <w:rFonts w:ascii="SutonnyMJ" w:hAnsi="SutonnyMJ" w:cs="SutonnyMJ"/>
                 <w:b/>
-                <w:sz w:val="24"/>
-                <w:szCs w:val="24"/>
-              </w:rPr>
-            </w:pPr>
-            <w:r>
-              <w:rPr>
-                <w:rFonts w:ascii="SutonnyMJ" w:hAnsi="SutonnyMJ" w:cs="SutonnyMJ"/>
-                <w:b/>
-                <w:sz w:val="24"/>
-                <w:szCs w:val="24"/>
+              </w:rPr>
+            </w:pPr>
+            <w:r>
+              <w:rPr>
+                <w:rFonts w:ascii="SutonnyMJ" w:hAnsi="SutonnyMJ" w:cs="SutonnyMJ"/>
+                <w:b/>
               </w:rPr>
               <w:t>Ab¨ Kv‡iv mv‡_ †L‡j Zvi c`ex</w:t>
             </w:r>
@@ -972,24 +979,6 @@
         </w:tc>
         <w:tc>
           <w:tcPr>
-            <w:tcW w:w="900" w:type="dxa"/>
-            <w:vMerge/>
-            <w:vAlign w:val="center"/>
-          </w:tcPr>
-          <w:p>
-            <w:pPr>
-              <w:jc w:val="center"/>
-              <w:rPr>
-                <w:rFonts w:ascii="SutonnyMJ" w:hAnsi="SutonnyMJ" w:cs="SutonnyMJ"/>
-                <w:b/>
-                <w:sz w:val="24"/>
-                <w:szCs w:val="24"/>
-              </w:rPr>
-            </w:pPr>
-          </w:p>
-        </w:tc>
-        <w:tc>
-          <w:tcPr>
             <w:tcW w:w="1080" w:type="dxa"/>
             <w:vMerge/>
             <w:vAlign w:val="center"/>
@@ -1008,6 +997,24 @@
         </w:tc>
         <w:tc>
           <w:tcPr>
+            <w:tcW w:w="990" w:type="dxa"/>
+            <w:vMerge/>
+            <w:vAlign w:val="center"/>
+          </w:tcPr>
+          <w:p>
+            <w:pPr>
+              <w:jc w:val="center"/>
+              <w:rPr>
+                <w:rFonts w:ascii="SutonnyMJ" w:hAnsi="SutonnyMJ" w:cs="SutonnyMJ"/>
+                <w:b/>
+                <w:sz w:val="24"/>
+                <w:szCs w:val="24"/>
+              </w:rPr>
+            </w:pPr>
+          </w:p>
+        </w:tc>
+        <w:tc>
+          <w:tcPr>
             <w:tcW w:w="1080" w:type="dxa"/>
             <w:vMerge/>
             <w:vAlign w:val="center"/>
@@ -1026,7 +1033,7 @@
         </w:tc>
         <w:tc>
           <w:tcPr>
-            <w:tcW w:w="1415" w:type="dxa"/>
+            <w:tcW w:w="1325" w:type="dxa"/>
             <w:gridSpan w:val="2"/>
             <w:vMerge/>
             <w:vAlign w:val="center"/>
@@ -1339,7 +1346,7 @@
         </w:tc>
         <w:tc>
           <w:tcPr>
-            <w:tcW w:w="900" w:type="dxa"/>
+            <w:tcW w:w="1080" w:type="dxa"/>
           </w:tcPr>
           <w:p>
             <w:pPr>
@@ -1364,6 +1371,31 @@
         </w:tc>
         <w:tc>
           <w:tcPr>
+            <w:tcW w:w="990" w:type="dxa"/>
+          </w:tcPr>
+          <w:p>
+            <w:pPr>
+              <w:jc w:val="center"/>
+              <w:rPr>
+                <w:rFonts w:ascii="SutonnyMJ" w:hAnsi="SutonnyMJ" w:cs="SutonnyMJ"/>
+                <w:b/>
+                <w:sz w:val="32"/>
+                <w:szCs w:val="32"/>
+              </w:rPr>
+            </w:pPr>
+            <w:r>
+              <w:rPr>
+                <w:rFonts w:ascii="SutonnyMJ" w:hAnsi="SutonnyMJ" w:cs="SutonnyMJ"/>
+                <w:b/>
+                <w:sz w:val="32"/>
+                <w:szCs w:val="32"/>
+              </w:rPr>
+              <w:t>200/-</w:t>
+            </w:r>
+          </w:p>
+        </w:tc>
+        <w:tc>
+          <w:tcPr>
             <w:tcW w:w="1080" w:type="dxa"/>
           </w:tcPr>
           <w:p>
@@ -1383,38 +1415,13 @@
                 <w:sz w:val="32"/>
                 <w:szCs w:val="32"/>
               </w:rPr>
-              <w:t>200/-</w:t>
-            </w:r>
-          </w:p>
-        </w:tc>
-        <w:tc>
-          <w:tcPr>
-            <w:tcW w:w="1080" w:type="dxa"/>
-          </w:tcPr>
-          <w:p>
-            <w:pPr>
-              <w:jc w:val="center"/>
-              <w:rPr>
-                <w:rFonts w:ascii="SutonnyMJ" w:hAnsi="SutonnyMJ" w:cs="SutonnyMJ"/>
-                <w:b/>
-                <w:sz w:val="32"/>
-                <w:szCs w:val="32"/>
-              </w:rPr>
-            </w:pPr>
-            <w:r>
-              <w:rPr>
-                <w:rFonts w:ascii="SutonnyMJ" w:hAnsi="SutonnyMJ" w:cs="SutonnyMJ"/>
-                <w:b/>
-                <w:sz w:val="32"/>
-                <w:szCs w:val="32"/>
-              </w:rPr>
               <w:t>2,117/-</w:t>
             </w:r>
           </w:p>
         </w:tc>
         <w:tc>
           <w:tcPr>
-            <w:tcW w:w="1415" w:type="dxa"/>
+            <w:tcW w:w="1325" w:type="dxa"/>
             <w:gridSpan w:val="2"/>
           </w:tcPr>
           <w:p>
@@ -1691,7 +1698,7 @@
         </w:tc>
         <w:tc>
           <w:tcPr>
-            <w:tcW w:w="900" w:type="dxa"/>
+            <w:tcW w:w="1080" w:type="dxa"/>
             <w:tcBorders>
               <w:bottom w:val="single" w:sz="4" w:space="0" w:color="auto"/>
             </w:tcBorders>
@@ -1710,6 +1717,34 @@
         </w:tc>
         <w:tc>
           <w:tcPr>
+            <w:tcW w:w="990" w:type="dxa"/>
+            <w:tcBorders>
+              <w:bottom w:val="single" w:sz="4" w:space="0" w:color="auto"/>
+            </w:tcBorders>
+          </w:tcPr>
+          <w:p>
+            <w:pPr>
+              <w:jc w:val="center"/>
+              <w:rPr>
+                <w:rFonts w:ascii="SutonnyMJ" w:hAnsi="SutonnyMJ" w:cs="SutonnyMJ"/>
+                <w:b/>
+                <w:sz w:val="32"/>
+                <w:szCs w:val="32"/>
+              </w:rPr>
+            </w:pPr>
+            <w:r>
+              <w:rPr>
+                <w:rFonts w:ascii="SutonnyMJ" w:hAnsi="SutonnyMJ" w:cs="SutonnyMJ"/>
+                <w:b/>
+                <w:sz w:val="32"/>
+                <w:szCs w:val="32"/>
+              </w:rPr>
+              <w:t>200/-</w:t>
+            </w:r>
+          </w:p>
+        </w:tc>
+        <w:tc>
+          <w:tcPr>
             <w:tcW w:w="1080" w:type="dxa"/>
             <w:tcBorders>
               <w:bottom w:val="single" w:sz="4" w:space="0" w:color="auto"/>
@@ -1738,35 +1773,7 @@
         </w:tc>
         <w:tc>
           <w:tcPr>
-            <w:tcW w:w="1080" w:type="dxa"/>
-            <w:tcBorders>
-              <w:bottom w:val="single" w:sz="4" w:space="0" w:color="auto"/>
-            </w:tcBorders>
-          </w:tcPr>
-          <w:p>
-            <w:pPr>
-              <w:jc w:val="center"/>
-              <w:rPr>
-                <w:rFonts w:ascii="SutonnyMJ" w:hAnsi="SutonnyMJ" w:cs="SutonnyMJ"/>
-                <w:b/>
-                <w:sz w:val="32"/>
-                <w:szCs w:val="32"/>
-              </w:rPr>
-            </w:pPr>
-            <w:r>
-              <w:rPr>
-                <w:rFonts w:ascii="SutonnyMJ" w:hAnsi="SutonnyMJ" w:cs="SutonnyMJ"/>
-                <w:b/>
-                <w:sz w:val="32"/>
-                <w:szCs w:val="32"/>
-              </w:rPr>
-              <w:t>200/-</w:t>
-            </w:r>
-          </w:p>
-        </w:tc>
-        <w:tc>
-          <w:tcPr>
-            <w:tcW w:w="1415" w:type="dxa"/>
+            <w:tcW w:w="1325" w:type="dxa"/>
             <w:gridSpan w:val="2"/>
             <w:tcBorders>
               <w:bottom w:val="single" w:sz="4" w:space="0" w:color="auto"/>
@@ -2059,7 +2066,7 @@
         </w:tc>
         <w:tc>
           <w:tcPr>
-            <w:tcW w:w="900" w:type="dxa"/>
+            <w:tcW w:w="1080" w:type="dxa"/>
             <w:tcBorders>
               <w:top w:val="single" w:sz="4" w:space="0" w:color="auto"/>
               <w:left w:val="single" w:sz="4" w:space="0" w:color="auto"/>
@@ -2081,7 +2088,7 @@
         </w:tc>
         <w:tc>
           <w:tcPr>
-            <w:tcW w:w="1080" w:type="dxa"/>
+            <w:tcW w:w="990" w:type="dxa"/>
             <w:tcBorders>
               <w:top w:val="single" w:sz="4" w:space="0" w:color="auto"/>
               <w:left w:val="single" w:sz="4" w:space="0" w:color="auto"/>
@@ -2142,7 +2149,7 @@
         </w:tc>
         <w:tc>
           <w:tcPr>
-            <w:tcW w:w="1415" w:type="dxa"/>
+            <w:tcW w:w="1325" w:type="dxa"/>
             <w:gridSpan w:val="2"/>
             <w:tcBorders>
               <w:top w:val="single" w:sz="4" w:space="0" w:color="auto"/>
@@ -2179,14 +2186,14 @@
         <w:gridCol w:w="1440"/>
         <w:gridCol w:w="4140"/>
         <w:gridCol w:w="1170"/>
-        <w:gridCol w:w="1170"/>
-        <w:gridCol w:w="900"/>
-        <w:gridCol w:w="900"/>
-        <w:gridCol w:w="1170"/>
-        <w:gridCol w:w="900"/>
+        <w:gridCol w:w="1147"/>
+        <w:gridCol w:w="923"/>
+        <w:gridCol w:w="967"/>
+        <w:gridCol w:w="1103"/>
+        <w:gridCol w:w="1057"/>
         <w:gridCol w:w="1080"/>
-        <w:gridCol w:w="1080"/>
-        <w:gridCol w:w="1440"/>
+        <w:gridCol w:w="990"/>
+        <w:gridCol w:w="1373"/>
       </w:tblGrid>
       <w:tr>
         <w:trPr>
@@ -2283,7 +2290,7 @@
         </w:tc>
         <w:tc>
           <w:tcPr>
-            <w:tcW w:w="2340" w:type="dxa"/>
+            <w:tcW w:w="2317" w:type="dxa"/>
             <w:gridSpan w:val="2"/>
             <w:tcBorders>
               <w:bottom w:val="single" w:sz="4" w:space="0" w:color="auto"/>
@@ -2314,7 +2321,7 @@
         </w:tc>
         <w:tc>
           <w:tcPr>
-            <w:tcW w:w="900" w:type="dxa"/>
+            <w:tcW w:w="923" w:type="dxa"/>
             <w:vMerge w:val="restart"/>
             <w:tcBorders>
               <w:left w:val="single" w:sz="4" w:space="0" w:color="auto"/>
@@ -2374,7 +2381,7 @@
         </w:tc>
         <w:tc>
           <w:tcPr>
-            <w:tcW w:w="900" w:type="dxa"/>
+            <w:tcW w:w="1057" w:type="dxa"/>
             <w:vMerge w:val="restart"/>
             <w:vAlign w:val="center"/>
           </w:tcPr>
@@ -2468,7 +2475,7 @@
         </w:tc>
         <w:tc>
           <w:tcPr>
-            <w:tcW w:w="1080" w:type="dxa"/>
+            <w:tcW w:w="990" w:type="dxa"/>
             <w:vMerge w:val="restart"/>
             <w:vAlign w:val="center"/>
           </w:tcPr>
@@ -2495,7 +2502,7 @@
         </w:tc>
         <w:tc>
           <w:tcPr>
-            <w:tcW w:w="1440" w:type="dxa"/>
+            <w:tcW w:w="1373" w:type="dxa"/>
             <w:vMerge w:val="restart"/>
             <w:vAlign w:val="center"/>
           </w:tcPr>
@@ -2505,16 +2512,12 @@
               <w:rPr>
                 <w:rFonts w:ascii="SutonnyMJ" w:hAnsi="SutonnyMJ" w:cs="SutonnyMJ"/>
                 <w:b/>
-                <w:sz w:val="24"/>
-                <w:szCs w:val="24"/>
-              </w:rPr>
-            </w:pPr>
-            <w:r>
-              <w:rPr>
-                <w:rFonts w:ascii="SutonnyMJ" w:hAnsi="SutonnyMJ" w:cs="SutonnyMJ"/>
-                <w:b/>
-                <w:sz w:val="24"/>
-                <w:szCs w:val="24"/>
+              </w:rPr>
+            </w:pPr>
+            <w:r>
+              <w:rPr>
+                <w:rFonts w:ascii="SutonnyMJ" w:hAnsi="SutonnyMJ" w:cs="SutonnyMJ"/>
+                <w:b/>
               </w:rPr>
               <w:t>Ab¨ Kv‡iv mv‡_ †L‡j Zvi c`ex</w:t>
             </w:r>
@@ -2627,7 +2630,7 @@
         </w:tc>
         <w:tc>
           <w:tcPr>
-            <w:tcW w:w="1170" w:type="dxa"/>
+            <w:tcW w:w="1147" w:type="dxa"/>
             <w:tcBorders>
               <w:top w:val="single" w:sz="4" w:space="0" w:color="auto"/>
               <w:right w:val="single" w:sz="4" w:space="0" w:color="auto"/>
@@ -2657,7 +2660,7 @@
         </w:tc>
         <w:tc>
           <w:tcPr>
-            <w:tcW w:w="900" w:type="dxa"/>
+            <w:tcW w:w="923" w:type="dxa"/>
             <w:vMerge/>
             <w:tcBorders>
               <w:left w:val="single" w:sz="4" w:space="0" w:color="auto"/>
@@ -2678,7 +2681,7 @@
         </w:tc>
         <w:tc>
           <w:tcPr>
-            <w:tcW w:w="900" w:type="dxa"/>
+            <w:tcW w:w="967" w:type="dxa"/>
             <w:tcBorders>
               <w:top w:val="single" w:sz="4" w:space="0" w:color="auto"/>
             </w:tcBorders>
@@ -2707,7 +2710,7 @@
         </w:tc>
         <w:tc>
           <w:tcPr>
-            <w:tcW w:w="1170" w:type="dxa"/>
+            <w:tcW w:w="1103" w:type="dxa"/>
             <w:tcBorders>
               <w:top w:val="single" w:sz="4" w:space="0" w:color="auto"/>
             </w:tcBorders>
@@ -2736,7 +2739,7 @@
         </w:tc>
         <w:tc>
           <w:tcPr>
-            <w:tcW w:w="900" w:type="dxa"/>
+            <w:tcW w:w="1057" w:type="dxa"/>
             <w:vMerge/>
             <w:vAlign w:val="center"/>
           </w:tcPr>
@@ -2772,7 +2775,7 @@
         </w:tc>
         <w:tc>
           <w:tcPr>
-            <w:tcW w:w="1080" w:type="dxa"/>
+            <w:tcW w:w="990" w:type="dxa"/>
             <w:vMerge/>
             <w:vAlign w:val="center"/>
           </w:tcPr>
@@ -2790,7 +2793,7 @@
         </w:tc>
         <w:tc>
           <w:tcPr>
-            <w:tcW w:w="1440" w:type="dxa"/>
+            <w:tcW w:w="1373" w:type="dxa"/>
             <w:vMerge/>
             <w:vAlign w:val="center"/>
           </w:tcPr>
@@ -2964,7 +2967,7 @@
         </w:tc>
         <w:tc>
           <w:tcPr>
-            <w:tcW w:w="1170" w:type="dxa"/>
+            <w:tcW w:w="1147" w:type="dxa"/>
             <w:tcBorders>
               <w:left w:val="single" w:sz="4" w:space="0" w:color="auto"/>
               <w:right w:val="single" w:sz="4" w:space="0" w:color="auto"/>
@@ -2993,7 +2996,7 @@
         </w:tc>
         <w:tc>
           <w:tcPr>
-            <w:tcW w:w="900" w:type="dxa"/>
+            <w:tcW w:w="923" w:type="dxa"/>
             <w:tcBorders>
               <w:left w:val="single" w:sz="4" w:space="0" w:color="auto"/>
             </w:tcBorders>
@@ -3021,7 +3024,7 @@
         </w:tc>
         <w:tc>
           <w:tcPr>
-            <w:tcW w:w="900" w:type="dxa"/>
+            <w:tcW w:w="967" w:type="dxa"/>
           </w:tcPr>
           <w:p>
             <w:pPr>
@@ -3055,7 +3058,7 @@
         </w:tc>
         <w:tc>
           <w:tcPr>
-            <w:tcW w:w="1170" w:type="dxa"/>
+            <w:tcW w:w="1103" w:type="dxa"/>
           </w:tcPr>
           <w:p>
             <w:pPr>
@@ -3080,7 +3083,7 @@
         </w:tc>
         <w:tc>
           <w:tcPr>
-            <w:tcW w:w="900" w:type="dxa"/>
+            <w:tcW w:w="1057" w:type="dxa"/>
           </w:tcPr>
           <w:p>
             <w:pPr>
@@ -3121,7 +3124,7 @@
         </w:tc>
         <w:tc>
           <w:tcPr>
-            <w:tcW w:w="1080" w:type="dxa"/>
+            <w:tcW w:w="990" w:type="dxa"/>
           </w:tcPr>
           <w:p>
             <w:pPr>
@@ -3146,7 +3149,7 @@
         </w:tc>
         <w:tc>
           <w:tcPr>
-            <w:tcW w:w="1440" w:type="dxa"/>
+            <w:tcW w:w="1373" w:type="dxa"/>
           </w:tcPr>
           <w:p>
             <w:pPr>
@@ -3306,7 +3309,7 @@
         </w:tc>
         <w:tc>
           <w:tcPr>
-            <w:tcW w:w="1170" w:type="dxa"/>
+            <w:tcW w:w="1147" w:type="dxa"/>
           </w:tcPr>
           <w:p>
             <w:pPr>
@@ -3331,7 +3334,7 @@
         </w:tc>
         <w:tc>
           <w:tcPr>
-            <w:tcW w:w="900" w:type="dxa"/>
+            <w:tcW w:w="923" w:type="dxa"/>
           </w:tcPr>
           <w:p>
             <w:pPr>
@@ -3356,39 +3359,39 @@
         </w:tc>
         <w:tc>
           <w:tcPr>
-            <w:tcW w:w="900" w:type="dxa"/>
-          </w:tcPr>
-          <w:p>
-            <w:pPr>
-              <w:jc w:val="center"/>
-              <w:rPr>
-                <w:rFonts w:ascii="SutonnyMJ" w:hAnsi="SutonnyMJ" w:cs="SutonnyMJ"/>
-                <w:b/>
-                <w:sz w:val="32"/>
-                <w:szCs w:val="32"/>
-              </w:rPr>
-            </w:pPr>
-          </w:p>
-        </w:tc>
-        <w:tc>
-          <w:tcPr>
-            <w:tcW w:w="1170" w:type="dxa"/>
-          </w:tcPr>
-          <w:p>
-            <w:pPr>
-              <w:jc w:val="center"/>
-              <w:rPr>
-                <w:rFonts w:ascii="SutonnyMJ" w:hAnsi="SutonnyMJ" w:cs="SutonnyMJ"/>
-                <w:b/>
-                <w:sz w:val="32"/>
-                <w:szCs w:val="32"/>
-              </w:rPr>
-            </w:pPr>
-          </w:p>
-        </w:tc>
-        <w:tc>
-          <w:tcPr>
-            <w:tcW w:w="900" w:type="dxa"/>
+            <w:tcW w:w="967" w:type="dxa"/>
+          </w:tcPr>
+          <w:p>
+            <w:pPr>
+              <w:jc w:val="center"/>
+              <w:rPr>
+                <w:rFonts w:ascii="SutonnyMJ" w:hAnsi="SutonnyMJ" w:cs="SutonnyMJ"/>
+                <w:b/>
+                <w:sz w:val="32"/>
+                <w:szCs w:val="32"/>
+              </w:rPr>
+            </w:pPr>
+          </w:p>
+        </w:tc>
+        <w:tc>
+          <w:tcPr>
+            <w:tcW w:w="1103" w:type="dxa"/>
+          </w:tcPr>
+          <w:p>
+            <w:pPr>
+              <w:jc w:val="center"/>
+              <w:rPr>
+                <w:rFonts w:ascii="SutonnyMJ" w:hAnsi="SutonnyMJ" w:cs="SutonnyMJ"/>
+                <w:b/>
+                <w:sz w:val="32"/>
+                <w:szCs w:val="32"/>
+              </w:rPr>
+            </w:pPr>
+          </w:p>
+        </w:tc>
+        <w:tc>
+          <w:tcPr>
+            <w:tcW w:w="1057" w:type="dxa"/>
           </w:tcPr>
           <w:p>
             <w:pPr>
@@ -3429,7 +3432,7 @@
         </w:tc>
         <w:tc>
           <w:tcPr>
-            <w:tcW w:w="1080" w:type="dxa"/>
+            <w:tcW w:w="990" w:type="dxa"/>
           </w:tcPr>
           <w:p>
             <w:pPr>
@@ -3454,7 +3457,7 @@
         </w:tc>
         <w:tc>
           <w:tcPr>
-            <w:tcW w:w="1440" w:type="dxa"/>
+            <w:tcW w:w="1373" w:type="dxa"/>
           </w:tcPr>
           <w:p>
             <w:pPr>
@@ -3611,7 +3614,7 @@
         </w:tc>
         <w:tc>
           <w:tcPr>
-            <w:tcW w:w="1170" w:type="dxa"/>
+            <w:tcW w:w="1147" w:type="dxa"/>
           </w:tcPr>
           <w:p>
             <w:pPr>
@@ -3636,7 +3639,7 @@
         </w:tc>
         <w:tc>
           <w:tcPr>
-            <w:tcW w:w="900" w:type="dxa"/>
+            <w:tcW w:w="923" w:type="dxa"/>
           </w:tcPr>
           <w:p>
             <w:pPr>
@@ -3661,39 +3664,39 @@
         </w:tc>
         <w:tc>
           <w:tcPr>
-            <w:tcW w:w="900" w:type="dxa"/>
-          </w:tcPr>
-          <w:p>
-            <w:pPr>
-              <w:jc w:val="center"/>
-              <w:rPr>
-                <w:rFonts w:ascii="SutonnyMJ" w:hAnsi="SutonnyMJ" w:cs="SutonnyMJ"/>
-                <w:b/>
-                <w:sz w:val="32"/>
-                <w:szCs w:val="32"/>
-              </w:rPr>
-            </w:pPr>
-          </w:p>
-        </w:tc>
-        <w:tc>
-          <w:tcPr>
-            <w:tcW w:w="1170" w:type="dxa"/>
-          </w:tcPr>
-          <w:p>
-            <w:pPr>
-              <w:jc w:val="center"/>
-              <w:rPr>
-                <w:rFonts w:ascii="SutonnyMJ" w:hAnsi="SutonnyMJ" w:cs="SutonnyMJ"/>
-                <w:b/>
-                <w:sz w:val="32"/>
-                <w:szCs w:val="32"/>
-              </w:rPr>
-            </w:pPr>
-          </w:p>
-        </w:tc>
-        <w:tc>
-          <w:tcPr>
-            <w:tcW w:w="900" w:type="dxa"/>
+            <w:tcW w:w="967" w:type="dxa"/>
+          </w:tcPr>
+          <w:p>
+            <w:pPr>
+              <w:jc w:val="center"/>
+              <w:rPr>
+                <w:rFonts w:ascii="SutonnyMJ" w:hAnsi="SutonnyMJ" w:cs="SutonnyMJ"/>
+                <w:b/>
+                <w:sz w:val="32"/>
+                <w:szCs w:val="32"/>
+              </w:rPr>
+            </w:pPr>
+          </w:p>
+        </w:tc>
+        <w:tc>
+          <w:tcPr>
+            <w:tcW w:w="1103" w:type="dxa"/>
+          </w:tcPr>
+          <w:p>
+            <w:pPr>
+              <w:jc w:val="center"/>
+              <w:rPr>
+                <w:rFonts w:ascii="SutonnyMJ" w:hAnsi="SutonnyMJ" w:cs="SutonnyMJ"/>
+                <w:b/>
+                <w:sz w:val="32"/>
+                <w:szCs w:val="32"/>
+              </w:rPr>
+            </w:pPr>
+          </w:p>
+        </w:tc>
+        <w:tc>
+          <w:tcPr>
+            <w:tcW w:w="1057" w:type="dxa"/>
           </w:tcPr>
           <w:p>
             <w:pPr>
@@ -3743,7 +3746,7 @@
         </w:tc>
         <w:tc>
           <w:tcPr>
-            <w:tcW w:w="1080" w:type="dxa"/>
+            <w:tcW w:w="990" w:type="dxa"/>
           </w:tcPr>
           <w:p>
             <w:pPr>
@@ -3768,7 +3771,7 @@
         </w:tc>
         <w:tc>
           <w:tcPr>
-            <w:tcW w:w="1440" w:type="dxa"/>
+            <w:tcW w:w="1373" w:type="dxa"/>
           </w:tcPr>
           <w:p>
             <w:pPr>
@@ -3916,7 +3919,7 @@
         </w:tc>
         <w:tc>
           <w:tcPr>
-            <w:tcW w:w="1170" w:type="dxa"/>
+            <w:tcW w:w="1147" w:type="dxa"/>
           </w:tcPr>
           <w:p>
             <w:pPr>
@@ -3941,7 +3944,7 @@
         </w:tc>
         <w:tc>
           <w:tcPr>
-            <w:tcW w:w="900" w:type="dxa"/>
+            <w:tcW w:w="923" w:type="dxa"/>
           </w:tcPr>
           <w:p>
             <w:pPr>
@@ -3966,7 +3969,7 @@
         </w:tc>
         <w:tc>
           <w:tcPr>
-            <w:tcW w:w="900" w:type="dxa"/>
+            <w:tcW w:w="967" w:type="dxa"/>
           </w:tcPr>
           <w:p>
             <w:pPr>
@@ -4000,7 +4003,7 @@
         </w:tc>
         <w:tc>
           <w:tcPr>
-            <w:tcW w:w="1170" w:type="dxa"/>
+            <w:tcW w:w="1103" w:type="dxa"/>
           </w:tcPr>
           <w:p>
             <w:pPr>
@@ -4025,7 +4028,7 @@
         </w:tc>
         <w:tc>
           <w:tcPr>
-            <w:tcW w:w="900" w:type="dxa"/>
+            <w:tcW w:w="1057" w:type="dxa"/>
           </w:tcPr>
           <w:p>
             <w:pPr>
@@ -4066,7 +4069,7 @@
         </w:tc>
         <w:tc>
           <w:tcPr>
-            <w:tcW w:w="1080" w:type="dxa"/>
+            <w:tcW w:w="990" w:type="dxa"/>
           </w:tcPr>
           <w:p>
             <w:pPr>
@@ -4091,7 +4094,7 @@
         </w:tc>
         <w:tc>
           <w:tcPr>
-            <w:tcW w:w="1440" w:type="dxa"/>
+            <w:tcW w:w="1373" w:type="dxa"/>
           </w:tcPr>
           <w:p>
             <w:pPr>
@@ -4143,14 +4146,14 @@
         <w:gridCol w:w="1440"/>
         <w:gridCol w:w="4140"/>
         <w:gridCol w:w="1170"/>
-        <w:gridCol w:w="1170"/>
-        <w:gridCol w:w="900"/>
-        <w:gridCol w:w="900"/>
-        <w:gridCol w:w="1170"/>
-        <w:gridCol w:w="900"/>
+        <w:gridCol w:w="1147"/>
+        <w:gridCol w:w="923"/>
+        <w:gridCol w:w="967"/>
+        <w:gridCol w:w="1103"/>
+        <w:gridCol w:w="1057"/>
         <w:gridCol w:w="1080"/>
-        <w:gridCol w:w="1080"/>
-        <w:gridCol w:w="1440"/>
+        <w:gridCol w:w="990"/>
+        <w:gridCol w:w="1373"/>
       </w:tblGrid>
       <w:tr>
         <w:trPr>
@@ -4258,7 +4261,7 @@
         </w:tc>
         <w:tc>
           <w:tcPr>
-            <w:tcW w:w="1170" w:type="dxa"/>
+            <w:tcW w:w="1147" w:type="dxa"/>
             <w:tcBorders>
               <w:top w:val="single" w:sz="4" w:space="0" w:color="auto"/>
               <w:right w:val="single" w:sz="4" w:space="0" w:color="auto"/>
@@ -4288,7 +4291,7 @@
         </w:tc>
         <w:tc>
           <w:tcPr>
-            <w:tcW w:w="900" w:type="dxa"/>
+            <w:tcW w:w="923" w:type="dxa"/>
             <w:vMerge/>
             <w:tcBorders>
               <w:left w:val="single" w:sz="4" w:space="0" w:color="auto"/>
@@ -4309,7 +4312,7 @@
         </w:tc>
         <w:tc>
           <w:tcPr>
-            <w:tcW w:w="900" w:type="dxa"/>
+            <w:tcW w:w="967" w:type="dxa"/>
             <w:tcBorders>
               <w:top w:val="single" w:sz="4" w:space="0" w:color="auto"/>
             </w:tcBorders>
@@ -4338,7 +4341,7 @@
         </w:tc>
         <w:tc>
           <w:tcPr>
-            <w:tcW w:w="1170" w:type="dxa"/>
+            <w:tcW w:w="1103" w:type="dxa"/>
             <w:tcBorders>
               <w:top w:val="single" w:sz="4" w:space="0" w:color="auto"/>
             </w:tcBorders>
@@ -4367,7 +4370,7 @@
         </w:tc>
         <w:tc>
           <w:tcPr>
-            <w:tcW w:w="900" w:type="dxa"/>
+            <w:tcW w:w="1057" w:type="dxa"/>
             <w:vMerge/>
             <w:vAlign w:val="center"/>
           </w:tcPr>
@@ -4403,7 +4406,7 @@
         </w:tc>
         <w:tc>
           <w:tcPr>
-            <w:tcW w:w="1080" w:type="dxa"/>
+            <w:tcW w:w="990" w:type="dxa"/>
             <w:vMerge/>
             <w:vAlign w:val="center"/>
           </w:tcPr>
@@ -4421,7 +4424,7 @@
         </w:tc>
         <w:tc>
           <w:tcPr>
-            <w:tcW w:w="1440" w:type="dxa"/>
+            <w:tcW w:w="1373" w:type="dxa"/>
             <w:vMerge/>
             <w:vAlign w:val="center"/>
           </w:tcPr>
@@ -4533,7 +4536,7 @@
         </w:tc>
         <w:tc>
           <w:tcPr>
-            <w:tcW w:w="2340" w:type="dxa"/>
+            <w:tcW w:w="2317" w:type="dxa"/>
             <w:gridSpan w:val="2"/>
             <w:tcBorders>
               <w:bottom w:val="single" w:sz="4" w:space="0" w:color="auto"/>
@@ -4564,7 +4567,7 @@
         </w:tc>
         <w:tc>
           <w:tcPr>
-            <w:tcW w:w="900" w:type="dxa"/>
+            <w:tcW w:w="923" w:type="dxa"/>
             <w:vMerge w:val="restart"/>
             <w:tcBorders>
               <w:left w:val="single" w:sz="4" w:space="0" w:color="auto"/>
@@ -4651,7 +4654,7 @@
         </w:tc>
         <w:tc>
           <w:tcPr>
-            <w:tcW w:w="900" w:type="dxa"/>
+            <w:tcW w:w="1057" w:type="dxa"/>
             <w:vMerge w:val="restart"/>
             <w:vAlign w:val="center"/>
           </w:tcPr>
@@ -4745,7 +4748,7 @@
         </w:tc>
         <w:tc>
           <w:tcPr>
-            <w:tcW w:w="1080" w:type="dxa"/>
+            <w:tcW w:w="990" w:type="dxa"/>
             <w:vMerge w:val="restart"/>
             <w:vAlign w:val="center"/>
           </w:tcPr>
@@ -4772,7 +4775,7 @@
         </w:tc>
         <w:tc>
           <w:tcPr>
-            <w:tcW w:w="1440" w:type="dxa"/>
+            <w:tcW w:w="1373" w:type="dxa"/>
             <w:vMerge w:val="restart"/>
             <w:vAlign w:val="center"/>
           </w:tcPr>
@@ -4782,16 +4785,12 @@
               <w:rPr>
                 <w:rFonts w:ascii="SutonnyMJ" w:hAnsi="SutonnyMJ" w:cs="SutonnyMJ"/>
                 <w:b/>
-                <w:sz w:val="24"/>
-                <w:szCs w:val="24"/>
-              </w:rPr>
-            </w:pPr>
-            <w:r>
-              <w:rPr>
-                <w:rFonts w:ascii="SutonnyMJ" w:hAnsi="SutonnyMJ" w:cs="SutonnyMJ"/>
-                <w:b/>
-                <w:sz w:val="24"/>
-                <w:szCs w:val="24"/>
+              </w:rPr>
+            </w:pPr>
+            <w:r>
+              <w:rPr>
+                <w:rFonts w:ascii="SutonnyMJ" w:hAnsi="SutonnyMJ" w:cs="SutonnyMJ"/>
+                <w:b/>
               </w:rPr>
               <w:t>Ab¨ Kv‡iv mv‡_ †L‡j Zvi c`ex</w:t>
             </w:r>
@@ -4928,7 +4927,7 @@
         </w:tc>
         <w:tc>
           <w:tcPr>
-            <w:tcW w:w="1170" w:type="dxa"/>
+            <w:tcW w:w="1147" w:type="dxa"/>
             <w:tcBorders>
               <w:left w:val="single" w:sz="4" w:space="0" w:color="auto"/>
               <w:right w:val="single" w:sz="4" w:space="0" w:color="auto"/>
@@ -4957,7 +4956,7 @@
         </w:tc>
         <w:tc>
           <w:tcPr>
-            <w:tcW w:w="900" w:type="dxa"/>
+            <w:tcW w:w="923" w:type="dxa"/>
             <w:tcBorders>
               <w:left w:val="single" w:sz="4" w:space="0" w:color="auto"/>
             </w:tcBorders>
@@ -4985,39 +4984,39 @@
         </w:tc>
         <w:tc>
           <w:tcPr>
-            <w:tcW w:w="900" w:type="dxa"/>
-          </w:tcPr>
-          <w:p>
-            <w:pPr>
-              <w:jc w:val="center"/>
-              <w:rPr>
-                <w:rFonts w:ascii="SutonnyMJ" w:hAnsi="SutonnyMJ" w:cs="SutonnyMJ"/>
-                <w:b/>
-                <w:sz w:val="32"/>
-                <w:szCs w:val="32"/>
-              </w:rPr>
-            </w:pPr>
-          </w:p>
-        </w:tc>
-        <w:tc>
-          <w:tcPr>
-            <w:tcW w:w="1170" w:type="dxa"/>
-          </w:tcPr>
-          <w:p>
-            <w:pPr>
-              <w:jc w:val="center"/>
-              <w:rPr>
-                <w:rFonts w:ascii="SutonnyMJ" w:hAnsi="SutonnyMJ" w:cs="SutonnyMJ"/>
-                <w:b/>
-                <w:sz w:val="32"/>
-                <w:szCs w:val="32"/>
-              </w:rPr>
-            </w:pPr>
-          </w:p>
-        </w:tc>
-        <w:tc>
-          <w:tcPr>
-            <w:tcW w:w="900" w:type="dxa"/>
+            <w:tcW w:w="967" w:type="dxa"/>
+          </w:tcPr>
+          <w:p>
+            <w:pPr>
+              <w:jc w:val="center"/>
+              <w:rPr>
+                <w:rFonts w:ascii="SutonnyMJ" w:hAnsi="SutonnyMJ" w:cs="SutonnyMJ"/>
+                <w:b/>
+                <w:sz w:val="32"/>
+                <w:szCs w:val="32"/>
+              </w:rPr>
+            </w:pPr>
+          </w:p>
+        </w:tc>
+        <w:tc>
+          <w:tcPr>
+            <w:tcW w:w="1103" w:type="dxa"/>
+          </w:tcPr>
+          <w:p>
+            <w:pPr>
+              <w:jc w:val="center"/>
+              <w:rPr>
+                <w:rFonts w:ascii="SutonnyMJ" w:hAnsi="SutonnyMJ" w:cs="SutonnyMJ"/>
+                <w:b/>
+                <w:sz w:val="32"/>
+                <w:szCs w:val="32"/>
+              </w:rPr>
+            </w:pPr>
+          </w:p>
+        </w:tc>
+        <w:tc>
+          <w:tcPr>
+            <w:tcW w:w="1057" w:type="dxa"/>
           </w:tcPr>
           <w:p>
             <w:pPr>
@@ -5049,7 +5048,7 @@
         </w:tc>
         <w:tc>
           <w:tcPr>
-            <w:tcW w:w="1080" w:type="dxa"/>
+            <w:tcW w:w="990" w:type="dxa"/>
           </w:tcPr>
           <w:p>
             <w:pPr>
@@ -5074,7 +5073,7 @@
         </w:tc>
         <w:tc>
           <w:tcPr>
-            <w:tcW w:w="1440" w:type="dxa"/>
+            <w:tcW w:w="1373" w:type="dxa"/>
           </w:tcPr>
           <w:p>
             <w:pPr>
@@ -5189,71 +5188,71 @@
         </w:tc>
         <w:tc>
           <w:tcPr>
-            <w:tcW w:w="1170" w:type="dxa"/>
-          </w:tcPr>
-          <w:p>
-            <w:pPr>
-              <w:jc w:val="center"/>
-              <w:rPr>
-                <w:rFonts w:ascii="SutonnyMJ" w:hAnsi="SutonnyMJ" w:cs="SutonnyMJ"/>
-                <w:b/>
-                <w:sz w:val="32"/>
-                <w:szCs w:val="32"/>
-              </w:rPr>
-            </w:pPr>
-          </w:p>
-        </w:tc>
-        <w:tc>
-          <w:tcPr>
-            <w:tcW w:w="900" w:type="dxa"/>
-          </w:tcPr>
-          <w:p>
-            <w:pPr>
-              <w:jc w:val="center"/>
-              <w:rPr>
-                <w:rFonts w:ascii="SutonnyMJ" w:hAnsi="SutonnyMJ" w:cs="SutonnyMJ"/>
-                <w:b/>
-                <w:sz w:val="32"/>
-                <w:szCs w:val="32"/>
-              </w:rPr>
-            </w:pPr>
-          </w:p>
-        </w:tc>
-        <w:tc>
-          <w:tcPr>
-            <w:tcW w:w="900" w:type="dxa"/>
-          </w:tcPr>
-          <w:p>
-            <w:pPr>
-              <w:jc w:val="center"/>
-              <w:rPr>
-                <w:rFonts w:ascii="SutonnyMJ" w:hAnsi="SutonnyMJ" w:cs="SutonnyMJ"/>
-                <w:b/>
-                <w:sz w:val="32"/>
-                <w:szCs w:val="32"/>
-              </w:rPr>
-            </w:pPr>
-          </w:p>
-        </w:tc>
-        <w:tc>
-          <w:tcPr>
-            <w:tcW w:w="1170" w:type="dxa"/>
-          </w:tcPr>
-          <w:p>
-            <w:pPr>
-              <w:jc w:val="center"/>
-              <w:rPr>
-                <w:rFonts w:ascii="SutonnyMJ" w:hAnsi="SutonnyMJ" w:cs="SutonnyMJ"/>
-                <w:b/>
-                <w:sz w:val="32"/>
-                <w:szCs w:val="32"/>
-              </w:rPr>
-            </w:pPr>
-          </w:p>
-        </w:tc>
-        <w:tc>
-          <w:tcPr>
-            <w:tcW w:w="900" w:type="dxa"/>
+            <w:tcW w:w="1147" w:type="dxa"/>
+          </w:tcPr>
+          <w:p>
+            <w:pPr>
+              <w:jc w:val="center"/>
+              <w:rPr>
+                <w:rFonts w:ascii="SutonnyMJ" w:hAnsi="SutonnyMJ" w:cs="SutonnyMJ"/>
+                <w:b/>
+                <w:sz w:val="32"/>
+                <w:szCs w:val="32"/>
+              </w:rPr>
+            </w:pPr>
+          </w:p>
+        </w:tc>
+        <w:tc>
+          <w:tcPr>
+            <w:tcW w:w="923" w:type="dxa"/>
+          </w:tcPr>
+          <w:p>
+            <w:pPr>
+              <w:jc w:val="center"/>
+              <w:rPr>
+                <w:rFonts w:ascii="SutonnyMJ" w:hAnsi="SutonnyMJ" w:cs="SutonnyMJ"/>
+                <w:b/>
+                <w:sz w:val="32"/>
+                <w:szCs w:val="32"/>
+              </w:rPr>
+            </w:pPr>
+          </w:p>
+        </w:tc>
+        <w:tc>
+          <w:tcPr>
+            <w:tcW w:w="967" w:type="dxa"/>
+          </w:tcPr>
+          <w:p>
+            <w:pPr>
+              <w:jc w:val="center"/>
+              <w:rPr>
+                <w:rFonts w:ascii="SutonnyMJ" w:hAnsi="SutonnyMJ" w:cs="SutonnyMJ"/>
+                <w:b/>
+                <w:sz w:val="32"/>
+                <w:szCs w:val="32"/>
+              </w:rPr>
+            </w:pPr>
+          </w:p>
+        </w:tc>
+        <w:tc>
+          <w:tcPr>
+            <w:tcW w:w="1103" w:type="dxa"/>
+          </w:tcPr>
+          <w:p>
+            <w:pPr>
+              <w:jc w:val="center"/>
+              <w:rPr>
+                <w:rFonts w:ascii="SutonnyMJ" w:hAnsi="SutonnyMJ" w:cs="SutonnyMJ"/>
+                <w:b/>
+                <w:sz w:val="32"/>
+                <w:szCs w:val="32"/>
+              </w:rPr>
+            </w:pPr>
+          </w:p>
+        </w:tc>
+        <w:tc>
+          <w:tcPr>
+            <w:tcW w:w="1057" w:type="dxa"/>
           </w:tcPr>
           <w:p>
             <w:pPr>
@@ -5285,23 +5284,23 @@
         </w:tc>
         <w:tc>
           <w:tcPr>
-            <w:tcW w:w="1080" w:type="dxa"/>
-          </w:tcPr>
-          <w:p>
-            <w:pPr>
-              <w:jc w:val="center"/>
-              <w:rPr>
-                <w:rFonts w:ascii="SutonnyMJ" w:hAnsi="SutonnyMJ" w:cs="SutonnyMJ"/>
-                <w:b/>
-                <w:sz w:val="32"/>
-                <w:szCs w:val="32"/>
-              </w:rPr>
-            </w:pPr>
-          </w:p>
-        </w:tc>
-        <w:tc>
-          <w:tcPr>
-            <w:tcW w:w="1440" w:type="dxa"/>
+            <w:tcW w:w="990" w:type="dxa"/>
+          </w:tcPr>
+          <w:p>
+            <w:pPr>
+              <w:jc w:val="center"/>
+              <w:rPr>
+                <w:rFonts w:ascii="SutonnyMJ" w:hAnsi="SutonnyMJ" w:cs="SutonnyMJ"/>
+                <w:b/>
+                <w:sz w:val="32"/>
+                <w:szCs w:val="32"/>
+              </w:rPr>
+            </w:pPr>
+          </w:p>
+        </w:tc>
+        <w:tc>
+          <w:tcPr>
+            <w:tcW w:w="1373" w:type="dxa"/>
           </w:tcPr>
           <w:p>
             <w:pPr>
@@ -5395,71 +5394,71 @@
         </w:tc>
         <w:tc>
           <w:tcPr>
-            <w:tcW w:w="1170" w:type="dxa"/>
-          </w:tcPr>
-          <w:p>
-            <w:pPr>
-              <w:jc w:val="center"/>
-              <w:rPr>
-                <w:rFonts w:ascii="SutonnyMJ" w:hAnsi="SutonnyMJ" w:cs="SutonnyMJ"/>
-                <w:b/>
-                <w:sz w:val="32"/>
-                <w:szCs w:val="32"/>
-              </w:rPr>
-            </w:pPr>
-          </w:p>
-        </w:tc>
-        <w:tc>
-          <w:tcPr>
-            <w:tcW w:w="900" w:type="dxa"/>
-          </w:tcPr>
-          <w:p>
-            <w:pPr>
-              <w:jc w:val="center"/>
-              <w:rPr>
-                <w:rFonts w:ascii="SutonnyMJ" w:hAnsi="SutonnyMJ" w:cs="SutonnyMJ"/>
-                <w:b/>
-                <w:sz w:val="32"/>
-                <w:szCs w:val="32"/>
-              </w:rPr>
-            </w:pPr>
-          </w:p>
-        </w:tc>
-        <w:tc>
-          <w:tcPr>
-            <w:tcW w:w="900" w:type="dxa"/>
-          </w:tcPr>
-          <w:p>
-            <w:pPr>
-              <w:jc w:val="center"/>
-              <w:rPr>
-                <w:rFonts w:ascii="SutonnyMJ" w:hAnsi="SutonnyMJ" w:cs="SutonnyMJ"/>
-                <w:b/>
-                <w:sz w:val="32"/>
-                <w:szCs w:val="32"/>
-              </w:rPr>
-            </w:pPr>
-          </w:p>
-        </w:tc>
-        <w:tc>
-          <w:tcPr>
-            <w:tcW w:w="1170" w:type="dxa"/>
-          </w:tcPr>
-          <w:p>
-            <w:pPr>
-              <w:jc w:val="center"/>
-              <w:rPr>
-                <w:rFonts w:ascii="SutonnyMJ" w:hAnsi="SutonnyMJ" w:cs="SutonnyMJ"/>
-                <w:b/>
-                <w:sz w:val="32"/>
-                <w:szCs w:val="32"/>
-              </w:rPr>
-            </w:pPr>
-          </w:p>
-        </w:tc>
-        <w:tc>
-          <w:tcPr>
-            <w:tcW w:w="900" w:type="dxa"/>
+            <w:tcW w:w="1147" w:type="dxa"/>
+          </w:tcPr>
+          <w:p>
+            <w:pPr>
+              <w:jc w:val="center"/>
+              <w:rPr>
+                <w:rFonts w:ascii="SutonnyMJ" w:hAnsi="SutonnyMJ" w:cs="SutonnyMJ"/>
+                <w:b/>
+                <w:sz w:val="32"/>
+                <w:szCs w:val="32"/>
+              </w:rPr>
+            </w:pPr>
+          </w:p>
+        </w:tc>
+        <w:tc>
+          <w:tcPr>
+            <w:tcW w:w="923" w:type="dxa"/>
+          </w:tcPr>
+          <w:p>
+            <w:pPr>
+              <w:jc w:val="center"/>
+              <w:rPr>
+                <w:rFonts w:ascii="SutonnyMJ" w:hAnsi="SutonnyMJ" w:cs="SutonnyMJ"/>
+                <w:b/>
+                <w:sz w:val="32"/>
+                <w:szCs w:val="32"/>
+              </w:rPr>
+            </w:pPr>
+          </w:p>
+        </w:tc>
+        <w:tc>
+          <w:tcPr>
+            <w:tcW w:w="967" w:type="dxa"/>
+          </w:tcPr>
+          <w:p>
+            <w:pPr>
+              <w:jc w:val="center"/>
+              <w:rPr>
+                <w:rFonts w:ascii="SutonnyMJ" w:hAnsi="SutonnyMJ" w:cs="SutonnyMJ"/>
+                <w:b/>
+                <w:sz w:val="32"/>
+                <w:szCs w:val="32"/>
+              </w:rPr>
+            </w:pPr>
+          </w:p>
+        </w:tc>
+        <w:tc>
+          <w:tcPr>
+            <w:tcW w:w="1103" w:type="dxa"/>
+          </w:tcPr>
+          <w:p>
+            <w:pPr>
+              <w:jc w:val="center"/>
+              <w:rPr>
+                <w:rFonts w:ascii="SutonnyMJ" w:hAnsi="SutonnyMJ" w:cs="SutonnyMJ"/>
+                <w:b/>
+                <w:sz w:val="32"/>
+                <w:szCs w:val="32"/>
+              </w:rPr>
+            </w:pPr>
+          </w:p>
+        </w:tc>
+        <w:tc>
+          <w:tcPr>
+            <w:tcW w:w="1057" w:type="dxa"/>
           </w:tcPr>
           <w:p>
             <w:pPr>
@@ -5491,23 +5490,23 @@
         </w:tc>
         <w:tc>
           <w:tcPr>
-            <w:tcW w:w="1080" w:type="dxa"/>
-          </w:tcPr>
-          <w:p>
-            <w:pPr>
-              <w:jc w:val="center"/>
-              <w:rPr>
-                <w:rFonts w:ascii="SutonnyMJ" w:hAnsi="SutonnyMJ" w:cs="SutonnyMJ"/>
-                <w:b/>
-                <w:sz w:val="32"/>
-                <w:szCs w:val="32"/>
-              </w:rPr>
-            </w:pPr>
-          </w:p>
-        </w:tc>
-        <w:tc>
-          <w:tcPr>
-            <w:tcW w:w="1440" w:type="dxa"/>
+            <w:tcW w:w="990" w:type="dxa"/>
+          </w:tcPr>
+          <w:p>
+            <w:pPr>
+              <w:jc w:val="center"/>
+              <w:rPr>
+                <w:rFonts w:ascii="SutonnyMJ" w:hAnsi="SutonnyMJ" w:cs="SutonnyMJ"/>
+                <w:b/>
+                <w:sz w:val="32"/>
+                <w:szCs w:val="32"/>
+              </w:rPr>
+            </w:pPr>
+          </w:p>
+        </w:tc>
+        <w:tc>
+          <w:tcPr>
+            <w:tcW w:w="1373" w:type="dxa"/>
           </w:tcPr>
           <w:p>
             <w:pPr>
@@ -5601,71 +5600,71 @@
         </w:tc>
         <w:tc>
           <w:tcPr>
-            <w:tcW w:w="1170" w:type="dxa"/>
-          </w:tcPr>
-          <w:p>
-            <w:pPr>
-              <w:jc w:val="center"/>
-              <w:rPr>
-                <w:rFonts w:ascii="SutonnyMJ" w:hAnsi="SutonnyMJ" w:cs="SutonnyMJ"/>
-                <w:b/>
-                <w:sz w:val="32"/>
-                <w:szCs w:val="32"/>
-              </w:rPr>
-            </w:pPr>
-          </w:p>
-        </w:tc>
-        <w:tc>
-          <w:tcPr>
-            <w:tcW w:w="900" w:type="dxa"/>
-          </w:tcPr>
-          <w:p>
-            <w:pPr>
-              <w:jc w:val="center"/>
-              <w:rPr>
-                <w:rFonts w:ascii="SutonnyMJ" w:hAnsi="SutonnyMJ" w:cs="SutonnyMJ"/>
-                <w:b/>
-                <w:sz w:val="32"/>
-                <w:szCs w:val="32"/>
-              </w:rPr>
-            </w:pPr>
-          </w:p>
-        </w:tc>
-        <w:tc>
-          <w:tcPr>
-            <w:tcW w:w="900" w:type="dxa"/>
-          </w:tcPr>
-          <w:p>
-            <w:pPr>
-              <w:jc w:val="center"/>
-              <w:rPr>
-                <w:rFonts w:ascii="SutonnyMJ" w:hAnsi="SutonnyMJ" w:cs="SutonnyMJ"/>
-                <w:b/>
-                <w:sz w:val="32"/>
-                <w:szCs w:val="32"/>
-              </w:rPr>
-            </w:pPr>
-          </w:p>
-        </w:tc>
-        <w:tc>
-          <w:tcPr>
-            <w:tcW w:w="1170" w:type="dxa"/>
-          </w:tcPr>
-          <w:p>
-            <w:pPr>
-              <w:jc w:val="center"/>
-              <w:rPr>
-                <w:rFonts w:ascii="SutonnyMJ" w:hAnsi="SutonnyMJ" w:cs="SutonnyMJ"/>
-                <w:b/>
-                <w:sz w:val="32"/>
-                <w:szCs w:val="32"/>
-              </w:rPr>
-            </w:pPr>
-          </w:p>
-        </w:tc>
-        <w:tc>
-          <w:tcPr>
-            <w:tcW w:w="900" w:type="dxa"/>
+            <w:tcW w:w="1147" w:type="dxa"/>
+          </w:tcPr>
+          <w:p>
+            <w:pPr>
+              <w:jc w:val="center"/>
+              <w:rPr>
+                <w:rFonts w:ascii="SutonnyMJ" w:hAnsi="SutonnyMJ" w:cs="SutonnyMJ"/>
+                <w:b/>
+                <w:sz w:val="32"/>
+                <w:szCs w:val="32"/>
+              </w:rPr>
+            </w:pPr>
+          </w:p>
+        </w:tc>
+        <w:tc>
+          <w:tcPr>
+            <w:tcW w:w="923" w:type="dxa"/>
+          </w:tcPr>
+          <w:p>
+            <w:pPr>
+              <w:jc w:val="center"/>
+              <w:rPr>
+                <w:rFonts w:ascii="SutonnyMJ" w:hAnsi="SutonnyMJ" w:cs="SutonnyMJ"/>
+                <w:b/>
+                <w:sz w:val="32"/>
+                <w:szCs w:val="32"/>
+              </w:rPr>
+            </w:pPr>
+          </w:p>
+        </w:tc>
+        <w:tc>
+          <w:tcPr>
+            <w:tcW w:w="967" w:type="dxa"/>
+          </w:tcPr>
+          <w:p>
+            <w:pPr>
+              <w:jc w:val="center"/>
+              <w:rPr>
+                <w:rFonts w:ascii="SutonnyMJ" w:hAnsi="SutonnyMJ" w:cs="SutonnyMJ"/>
+                <w:b/>
+                <w:sz w:val="32"/>
+                <w:szCs w:val="32"/>
+              </w:rPr>
+            </w:pPr>
+          </w:p>
+        </w:tc>
+        <w:tc>
+          <w:tcPr>
+            <w:tcW w:w="1103" w:type="dxa"/>
+          </w:tcPr>
+          <w:p>
+            <w:pPr>
+              <w:jc w:val="center"/>
+              <w:rPr>
+                <w:rFonts w:ascii="SutonnyMJ" w:hAnsi="SutonnyMJ" w:cs="SutonnyMJ"/>
+                <w:b/>
+                <w:sz w:val="32"/>
+                <w:szCs w:val="32"/>
+              </w:rPr>
+            </w:pPr>
+          </w:p>
+        </w:tc>
+        <w:tc>
+          <w:tcPr>
+            <w:tcW w:w="1057" w:type="dxa"/>
           </w:tcPr>
           <w:p>
             <w:pPr>
@@ -5697,23 +5696,23 @@
         </w:tc>
         <w:tc>
           <w:tcPr>
-            <w:tcW w:w="1080" w:type="dxa"/>
-          </w:tcPr>
-          <w:p>
-            <w:pPr>
-              <w:jc w:val="center"/>
-              <w:rPr>
-                <w:rFonts w:ascii="SutonnyMJ" w:hAnsi="SutonnyMJ" w:cs="SutonnyMJ"/>
-                <w:b/>
-                <w:sz w:val="32"/>
-                <w:szCs w:val="32"/>
-              </w:rPr>
-            </w:pPr>
-          </w:p>
-        </w:tc>
-        <w:tc>
-          <w:tcPr>
-            <w:tcW w:w="1440" w:type="dxa"/>
+            <w:tcW w:w="990" w:type="dxa"/>
+          </w:tcPr>
+          <w:p>
+            <w:pPr>
+              <w:jc w:val="center"/>
+              <w:rPr>
+                <w:rFonts w:ascii="SutonnyMJ" w:hAnsi="SutonnyMJ" w:cs="SutonnyMJ"/>
+                <w:b/>
+                <w:sz w:val="32"/>
+                <w:szCs w:val="32"/>
+              </w:rPr>
+            </w:pPr>
+          </w:p>
+        </w:tc>
+        <w:tc>
+          <w:tcPr>
+            <w:tcW w:w="1373" w:type="dxa"/>
           </w:tcPr>
           <w:p>
             <w:pPr>
@@ -9711,8 +9710,6 @@
                 <w:szCs w:val="32"/>
               </w:rPr>
             </w:pPr>
-            <w:bookmarkStart w:id="0" w:name="_GoBack"/>
-            <w:bookmarkEnd w:id="0"/>
             <w:r>
               <w:rPr>
                 <w:rFonts w:ascii="SutonnyMJ" w:hAnsi="SutonnyMJ" w:cs="SutonnyMJ"/>
@@ -10582,7 +10579,7 @@
 </file>
 
 <file path=customXml/itemProps1.xml><?xml version="1.0" encoding="utf-8"?>
-<ds:datastoreItem xmlns:ds="http://schemas.openxmlformats.org/officeDocument/2006/customXml" ds:itemID="{1E50EAE8-D5FD-4E4D-9B14-1CE892621F7E}">
+<ds:datastoreItem xmlns:ds="http://schemas.openxmlformats.org/officeDocument/2006/customXml" ds:itemID="{48894291-6F68-4F63-9C9F-86D4BE3EC706}">
   <ds:schemaRefs>
     <ds:schemaRef ds:uri="http://schemas.openxmlformats.org/officeDocument/2006/bibliography"/>
   </ds:schemaRefs>

</xml_diff>